<commit_message>
fix v0.4.1: undefined no overlay (res.mao.nombre), roleta portada do padrao Antigravity (viewbox fixo + tira no fluxo + 1 transition em transform, sem voltas fora da tira), CHARA: KARMA vira botao de dano total e O Vazio removido
</commit_message>
<xml_diff>
--- a/relatorio.docx
+++ b/relatorio.docx
@@ -2,7 +2,7 @@
 <file path=word/document.xml><?xml version="1.0" encoding="utf-8"?>
 <w:document xmlns:w="http://schemas.openxmlformats.org/wordprocessingml/2006/main" xmlns:m="http://schemas.openxmlformats.org/officeDocument/2006/math" xmlns:r="http://schemas.openxmlformats.org/officeDocument/2006/relationships" xmlns:o="urn:schemas-microsoft-com:office:office" xmlns:v="urn:schemas-microsoft-com:vml" xmlns:w10="urn:schemas-microsoft-com:office:word" xmlns:a="http://schemas.openxmlformats.org/drawingml/2006/main" xmlns:pic="http://schemas.openxmlformats.org/drawingml/2006/picture" xmlns:wp="http://schemas.openxmlformats.org/drawingml/2006/wordprocessingDrawing">
   <w:body>
-    <w:bookmarkStart w:id="55" w:name="roteiro-de-atividade-prática"/>
+    <w:bookmarkStart w:id="56" w:name="roteiro-de-atividade-prática"/>
     <w:p>
       <w:pPr>
         <w:pStyle w:val="Heading1"/>
@@ -5410,7 +5410,7 @@
     </w:p>
     <w:bookmarkEnd w:id="46"/>
     <w:bookmarkEnd w:id="47"/>
-    <w:bookmarkStart w:id="54" w:name="Xe7732bccc4a9a7dbf2cdf62178489cc11860924"/>
+    <w:bookmarkStart w:id="55" w:name="Xe7732bccc4a9a7dbf2cdf62178489cc11860924"/>
     <w:p>
       <w:pPr>
         <w:pStyle w:val="Heading2"/>
@@ -6240,8 +6240,289 @@
       </w:r>
     </w:p>
     <w:bookmarkEnd w:id="53"/>
+    <w:bookmarkStart w:id="54" w:name="correções-pós-release-v0.4.1"/>
+    <w:p>
+      <w:pPr>
+        <w:pStyle w:val="Heading3"/>
+      </w:pPr>
+      <w:r>
+        <w:t xml:space="preserve">18.7 Correções pós-release (v0.4.1)</w:t>
+      </w:r>
+    </w:p>
+    <w:p>
+      <w:pPr>
+        <w:pStyle w:val="FirstParagraph"/>
+      </w:pPr>
+      <w:r>
+        <w:t xml:space="preserve">Jogando a v0.4.0 de verdade no celular, três problemas apareceram e foram resolvidos:</w:t>
+      </w:r>
+      <w:r>
+        <w:t xml:space="preserve"> </w:t>
+      </w:r>
+      <w:r>
+        <w:t xml:space="preserve">-</w:t>
+      </w:r>
+      <w:r>
+        <w:t xml:space="preserve"> </w:t>
+      </w:r>
+      <w:r>
+        <w:rPr>
+          <w:b/>
+          <w:bCs/>
+        </w:rPr>
+        <w:t xml:space="preserve">“undefined”</w:t>
+      </w:r>
+      <w:r>
+        <w:rPr>
+          <w:b/>
+          <w:bCs/>
+        </w:rPr>
+        <w:t xml:space="preserve"> </w:t>
+      </w:r>
+      <w:r>
+        <w:rPr>
+          <w:b/>
+          <w:bCs/>
+        </w:rPr>
+        <w:t xml:space="preserve">no overlay</w:t>
+      </w:r>
+      <w:r>
+        <w:t xml:space="preserve">: o nome da mão exibido vinha do campo errado (</w:t>
+      </w:r>
+      <w:r>
+        <w:rPr>
+          <w:rStyle w:val="VerbatimChar"/>
+        </w:rPr>
+        <w:t xml:space="preserve">res.mao.nome</w:t>
+      </w:r>
+      <w:r>
+        <w:t xml:space="preserve"> </w:t>
+      </w:r>
+      <w:r>
+        <w:t xml:space="preserve">em vez de</w:t>
+      </w:r>
+      <w:r>
+        <w:t xml:space="preserve"> </w:t>
+      </w:r>
+      <w:r>
+        <w:rPr>
+          <w:rStyle w:val="VerbatimChar"/>
+        </w:rPr>
+        <w:t xml:space="preserve">res.mao.nombre</w:t>
+      </w:r>
+      <w:r>
+        <w:t xml:space="preserve">) — toda mão jogada mostrava</w:t>
+      </w:r>
+      <w:r>
+        <w:t xml:space="preserve"> </w:t>
+      </w:r>
+      <w:r>
+        <w:t xml:space="preserve">“undefined”</w:t>
+      </w:r>
+      <w:r>
+        <w:t xml:space="preserve">. Corrigido e coberto por verificação de interface;</w:t>
+      </w:r>
+      <w:r>
+        <w:t xml:space="preserve"> </w:t>
+      </w:r>
+      <w:r>
+        <w:t xml:space="preserve">-</w:t>
+      </w:r>
+      <w:r>
+        <w:t xml:space="preserve"> </w:t>
+      </w:r>
+      <w:r>
+        <w:rPr>
+          <w:b/>
+          <w:bCs/>
+        </w:rPr>
+        <w:t xml:space="preserve">Roleta reescrita com o padrão do Antigravity</w:t>
+      </w:r>
+      <w:r>
+        <w:t xml:space="preserve">: o giro antigo somava voltas extras além do fim da tira (o deslocamento chegava a -2.400px numa tira de 1.512px — no celular a pista ficava vazia). O novo desenho usa o layout provado: viewbox de largura fixa (252px), tira no fluxo normal (sem</w:t>
+      </w:r>
+      <w:r>
+        <w:t xml:space="preserve"> </w:t>
+      </w:r>
+      <w:r>
+        <w:rPr>
+          <w:rStyle w:val="VerbatimChar"/>
+        </w:rPr>
+        <w:t xml:space="preserve">position: absolute</w:t>
+      </w:r>
+      <w:r>
+        <w:t xml:space="preserve">) e</w:t>
+      </w:r>
+      <w:r>
+        <w:t xml:space="preserve"> </w:t>
+      </w:r>
+      <w:r>
+        <w:rPr>
+          <w:b/>
+          <w:bCs/>
+        </w:rPr>
+        <w:t xml:space="preserve">uma única transição CSS em</w:t>
+      </w:r>
+      <w:r>
+        <w:rPr>
+          <w:b/>
+          <w:bCs/>
+        </w:rPr>
+        <w:t xml:space="preserve"> </w:t>
+      </w:r>
+      <w:r>
+        <w:rPr>
+          <w:rStyle w:val="VerbatimChar"/>
+          <w:b/>
+          <w:bCs/>
+        </w:rPr>
+        <w:t xml:space="preserve">transform</w:t>
+      </w:r>
+      <w:r>
+        <w:t xml:space="preserve">, com o prêmio sempre na cópia do meio da tira;</w:t>
+      </w:r>
+      <w:r>
+        <w:t xml:space="preserve"> </w:t>
+      </w:r>
+      <w:r>
+        <w:t xml:space="preserve">-</w:t>
+      </w:r>
+      <w:r>
+        <w:t xml:space="preserve"> </w:t>
+      </w:r>
+      <w:r>
+        <w:rPr>
+          <w:b/>
+          <w:bCs/>
+        </w:rPr>
+        <w:t xml:space="preserve">Modo CHARA revisado</w:t>
+      </w:r>
+      <w:r>
+        <w:t xml:space="preserve">: o cheat Karma virou um</w:t>
+      </w:r>
+      <w:r>
+        <w:t xml:space="preserve"> </w:t>
+      </w:r>
+      <w:r>
+        <w:rPr>
+          <w:b/>
+          <w:bCs/>
+        </w:rPr>
+        <w:t xml:space="preserve">botão</w:t>
+      </w:r>
+      <w:r>
+        <w:rPr>
+          <w:b/>
+          <w:bCs/>
+        </w:rPr>
+        <w:t xml:space="preserve"> </w:t>
+      </w:r>
+      <w:r>
+        <w:rPr>
+          <w:b/>
+          <w:bCs/>
+        </w:rPr>
+        <w:t xml:space="preserve">“🔪 KARMA — DANO TOTAL”</w:t>
+      </w:r>
+      <w:r>
+        <w:t xml:space="preserve"> </w:t>
+      </w:r>
+      <w:r>
+        <w:t xml:space="preserve">(aplica o dano pelo fluxo visual completo — número flutuante, frame de dor e barra de vida — e segue para a roleta/loja, permitindo analisar a luta); o cheat</w:t>
+      </w:r>
+      <w:r>
+        <w:t xml:space="preserve"> </w:t>
+      </w:r>
+      <w:r>
+        <w:rPr>
+          <w:b/>
+          <w:bCs/>
+        </w:rPr>
+        <w:t xml:space="preserve">O Vazio foi removido</w:t>
+      </w:r>
+      <w:r>
+        <w:t xml:space="preserve"> </w:t>
+      </w:r>
+      <w:r>
+        <w:t xml:space="preserve">(abolia os alvos e impedia testar a dificuldade real). Ficaram 4 cheats: Determinação, Karma (botão), Temmie e Muffet.</w:t>
+      </w:r>
+    </w:p>
+    <w:p>
+      <w:pPr>
+        <w:pStyle w:val="BodyText"/>
+      </w:pPr>
+      <w:r>
+        <w:rPr>
+          <w:b/>
+          <w:bCs/>
+        </w:rPr>
+        <w:t xml:space="preserve">Validação da v0.4.1:</w:t>
+      </w:r>
+      <w:r>
+        <w:t xml:space="preserve"> </w:t>
+      </w:r>
+      <w:r>
+        <w:t xml:space="preserve">testes unitários 0 falhas ·</w:t>
+      </w:r>
+      <w:r>
+        <w:t xml:space="preserve"> </w:t>
+      </w:r>
+      <w:r>
+        <w:rPr>
+          <w:b/>
+          <w:bCs/>
+        </w:rPr>
+        <w:t xml:space="preserve">24 verificações de interface</w:t>
+      </w:r>
+      <w:r>
+        <w:t xml:space="preserve"> </w:t>
+      </w:r>
+      <w:r>
+        <w:t xml:space="preserve">(2 novas: nome da mão sem</w:t>
+      </w:r>
+      <w:r>
+        <w:t xml:space="preserve"> </w:t>
+      </w:r>
+      <w:r>
+        <w:t xml:space="preserve">“undefined”</w:t>
+      </w:r>
+      <w:r>
+        <w:t xml:space="preserve"> </w:t>
+      </w:r>
+      <w:r>
+        <w:t xml:space="preserve">e botão KARMA oculto fora do CHARA) · 0 IDs em falta · sonda jsdom confirmou mão</w:t>
+      </w:r>
+      <w:r>
+        <w:t xml:space="preserve"> </w:t>
+      </w:r>
+      <w:r>
+        <w:t xml:space="preserve">“Par”</w:t>
+      </w:r>
+      <w:r>
+        <w:t xml:space="preserve"> </w:t>
+      </w:r>
+      <w:r>
+        <w:t xml:space="preserve">no overlay, KARMA aplicando 300/300 de dano e a roleta girando até</w:t>
+      </w:r>
+      <w:r>
+        <w:t xml:space="preserve"> </w:t>
+      </w:r>
+      <w:r>
+        <w:rPr>
+          <w:rStyle w:val="VerbatimChar"/>
+        </w:rPr>
+        <w:t xml:space="preserve">-504px</w:t>
+      </w:r>
+      <w:r>
+        <w:t xml:space="preserve"> </w:t>
+      </w:r>
+      <w:r>
+        <w:t xml:space="preserve">com prêmio + legenda.</w:t>
+      </w:r>
+    </w:p>
     <w:bookmarkEnd w:id="54"/>
     <w:bookmarkEnd w:id="55"/>
+    <w:bookmarkEnd w:id="56"/>
     <w:sectPr>
       <w:footnotePr>
         <w:numRestart w:val="eachSect"/>

</xml_diff>

<commit_message>
fix v0.4.2: CHARA nao altera mais records (5 guardas), barra de acoes oculta fora do jogo, KARMA limpa a selecao (fim do insta-kill na loja), testes de Royal Flush e carta duplicada
</commit_message>
<xml_diff>
--- a/relatorio.docx
+++ b/relatorio.docx
@@ -2,7 +2,7 @@
 <file path=word/document.xml><?xml version="1.0" encoding="utf-8"?>
 <w:document xmlns:w="http://schemas.openxmlformats.org/wordprocessingml/2006/main" xmlns:m="http://schemas.openxmlformats.org/officeDocument/2006/math" xmlns:r="http://schemas.openxmlformats.org/officeDocument/2006/relationships" xmlns:o="urn:schemas-microsoft-com:office:office" xmlns:v="urn:schemas-microsoft-com:vml" xmlns:w10="urn:schemas-microsoft-com:office:word" xmlns:a="http://schemas.openxmlformats.org/drawingml/2006/main" xmlns:pic="http://schemas.openxmlformats.org/drawingml/2006/picture" xmlns:wp="http://schemas.openxmlformats.org/drawingml/2006/wordprocessingDrawing">
   <w:body>
-    <w:bookmarkStart w:id="56" w:name="roteiro-de-atividade-prática"/>
+    <w:bookmarkStart w:id="57" w:name="roteiro-de-atividade-prática"/>
     <w:p>
       <w:pPr>
         <w:pStyle w:val="Heading1"/>
@@ -5410,7 +5410,7 @@
     </w:p>
     <w:bookmarkEnd w:id="46"/>
     <w:bookmarkEnd w:id="47"/>
-    <w:bookmarkStart w:id="55" w:name="Xe7732bccc4a9a7dbf2cdf62178489cc11860924"/>
+    <w:bookmarkStart w:id="56" w:name="Xe7732bccc4a9a7dbf2cdf62178489cc11860924"/>
     <w:p>
       <w:pPr>
         <w:pStyle w:val="Heading2"/>
@@ -6521,8 +6521,201 @@
       </w:r>
     </w:p>
     <w:bookmarkEnd w:id="54"/>
+    <w:bookmarkStart w:id="55" w:name="correções-pós-release-v0.4.2"/>
+    <w:p>
+      <w:pPr>
+        <w:pStyle w:val="Heading3"/>
+      </w:pPr>
+      <w:r>
+        <w:t xml:space="preserve">18.8 Correções pós-release (v0.4.2)</w:t>
+      </w:r>
+    </w:p>
+    <w:p>
+      <w:pPr>
+        <w:pStyle w:val="FirstParagraph"/>
+      </w:pPr>
+      <w:r>
+        <w:t xml:space="preserve">Três problemas reportados após jogar a v0.4.1 no celular:</w:t>
+      </w:r>
+      <w:r>
+        <w:t xml:space="preserve"> </w:t>
+      </w:r>
+      <w:r>
+        <w:t xml:space="preserve">-</w:t>
+      </w:r>
+      <w:r>
+        <w:t xml:space="preserve"> </w:t>
+      </w:r>
+      <w:r>
+        <w:rPr>
+          <w:b/>
+          <w:bCs/>
+        </w:rPr>
+        <w:t xml:space="preserve">Modo CHARA gravava recordes</w:t>
+      </w:r>
+      <w:r>
+        <w:t xml:space="preserve">: os contadores eram alterados em memória (partidas, chefões vencidos, melhor pontuação, coringas coletados) mesmo com a gravação bloqueada — o valor poluído vazava para a próxima partida normal. Guardas aplicados nos 5 pontos de alteração;</w:t>
+      </w:r>
+      <w:r>
+        <w:t xml:space="preserve"> </w:t>
+      </w:r>
+      <w:r>
+        <w:t xml:space="preserve">-</w:t>
+      </w:r>
+      <w:r>
+        <w:t xml:space="preserve"> </w:t>
+      </w:r>
+      <w:r>
+        <w:rPr>
+          <w:b/>
+          <w:bCs/>
+        </w:rPr>
+        <w:t xml:space="preserve">Barra de ações fixa aparecia na loja</w:t>
+      </w:r>
+      <w:r>
+        <w:t xml:space="preserve">: o rodapé (JOGAR MÃO/DESCARTAR/ORDENAR) fica fora das telas no HTML e era sempre visível. Agora o</w:t>
+      </w:r>
+      <w:r>
+        <w:t xml:space="preserve"> </w:t>
+      </w:r>
+      <w:r>
+        <w:rPr>
+          <w:rStyle w:val="VerbatimChar"/>
+        </w:rPr>
+        <w:t xml:space="preserve">mostrarPantalla</w:t>
+      </w:r>
+      <w:r>
+        <w:t xml:space="preserve"> </w:t>
+      </w:r>
+      <w:r>
+        <w:t xml:space="preserve">o esconde fora da tela de jogo; e, no modo CHARA, o botão KARMA</w:t>
+      </w:r>
+      <w:r>
+        <w:t xml:space="preserve"> </w:t>
+      </w:r>
+      <w:r>
+        <w:rPr>
+          <w:b/>
+          <w:bCs/>
+        </w:rPr>
+        <w:t xml:space="preserve">limpa a seleção de cartas</w:t>
+      </w:r>
+      <w:r>
+        <w:t xml:space="preserve"> </w:t>
+      </w:r>
+      <w:r>
+        <w:t xml:space="preserve">ao aplicar o dano — era isso que permitia</w:t>
+      </w:r>
+      <w:r>
+        <w:t xml:space="preserve"> </w:t>
+      </w:r>
+      <w:r>
+        <w:t xml:space="preserve">“jogar a mão na loja”</w:t>
+      </w:r>
+      <w:r>
+        <w:t xml:space="preserve"> </w:t>
+      </w:r>
+      <w:r>
+        <w:t xml:space="preserve">e vencer o chefão de novo;</w:t>
+      </w:r>
+      <w:r>
+        <w:t xml:space="preserve"> </w:t>
+      </w:r>
+      <w:r>
+        <w:t xml:space="preserve">-</w:t>
+      </w:r>
+      <w:r>
+        <w:t xml:space="preserve"> </w:t>
+      </w:r>
+      <w:r>
+        <w:rPr>
+          <w:b/>
+          <w:bCs/>
+        </w:rPr>
+        <w:t xml:space="preserve">Royal Flush</w:t>
+      </w:r>
+      <w:r>
+        <w:t xml:space="preserve">: investigado com teste direto no avaliador —</w:t>
+      </w:r>
+      <w:r>
+        <w:t xml:space="preserve"> </w:t>
+      </w:r>
+      <w:r>
+        <w:rPr>
+          <w:b/>
+          <w:bCs/>
+        </w:rPr>
+        <w:t xml:space="preserve">funciona corretamente</w:t>
+      </w:r>
+      <w:r>
+        <w:t xml:space="preserve"> </w:t>
+      </w:r>
+      <w:r>
+        <w:t xml:space="preserve">(</w:t>
+      </w:r>
+      <w:r>
+        <w:rPr>
+          <w:rStyle w:val="VerbatimChar"/>
+        </w:rPr>
+        <w:t xml:space="preserve">10♠ J♠ Q♠ K♠ A♠</w:t>
+      </w:r>
+      <w:r>
+        <w:t xml:space="preserve"> </w:t>
+      </w:r>
+      <w:r>
+        <w:t xml:space="preserve">→ Royal Flush, inclusive contra o chefão Baralho Sujo). Adicionados 3 testes unitários (Royal, Sequência de Cor com 5 cartas e o caso de carta duplicada: duas cópias do 10</w:t>
+      </w:r>
+      <w:r>
+        <w:t xml:space="preserve"> </w:t>
+      </w:r>
+      <w:r>
+        <w:rPr>
+          <w:b/>
+          <w:bCs/>
+        </w:rPr>
+        <w:t xml:space="preserve">não</w:t>
+      </w:r>
+      <w:r>
+        <w:t xml:space="preserve"> </w:t>
+      </w:r>
+      <w:r>
+        <w:t xml:space="preserve">formam Royal, fica Cor).</w:t>
+      </w:r>
+    </w:p>
+    <w:p>
+      <w:pPr>
+        <w:pStyle w:val="BodyText"/>
+      </w:pPr>
+      <w:r>
+        <w:rPr>
+          <w:b/>
+          <w:bCs/>
+        </w:rPr>
+        <w:t xml:space="preserve">Validação da v0.4.2:</w:t>
+      </w:r>
+      <w:r>
+        <w:t xml:space="preserve"> </w:t>
+      </w:r>
+      <w:r>
+        <w:t xml:space="preserve">81 testes unitários, 0 falhas (3 novos) · 25 verificações de interface (1 nova: barra oculta na loja) · sonda jsdom confirmou: partida CHARA inteira</w:t>
+      </w:r>
+      <w:r>
+        <w:t xml:space="preserve"> </w:t>
+      </w:r>
+      <w:r>
+        <w:rPr>
+          <w:b/>
+          <w:bCs/>
+        </w:rPr>
+        <w:t xml:space="preserve">sem gravar nada no localStorage</w:t>
+      </w:r>
+      <w:r>
+        <w:t xml:space="preserve">, barra oculta na loja, tentativa de jogar na loja ignorada e barra de volta no jogo.</w:t>
+      </w:r>
+    </w:p>
     <w:bookmarkEnd w:id="55"/>
     <w:bookmarkEnd w:id="56"/>
+    <w:bookmarkEnd w:id="57"/>
     <w:sectPr>
       <w:footnotePr>
         <w:numRestart w:val="eachSect"/>

</xml_diff>